<commit_message>
vault backup: 2026-03-09 17:24:56
</commit_message>
<xml_diff>
--- a/Investigare/pg/Scheda_PG_01_Yamamoto_Kenji.docx
+++ b/Investigare/pg/Scheda_PG_01_Yamamoto_Kenji.docx
@@ -8300,48 +8300,6 @@
           <w:sz w:val="18"/>
         </w:rPr>
         <w:t>.”</w:t>
-      </w:r>
-    </w:p>
-    <w:p>
-      <w:pPr>
-        <w:spacing w:before="120" w:after="120"/>
-        <w:jc w:val="center"/>
-      </w:pPr>
-      <w:r>
-        <w:rPr>
-          <w:color w:val="B49650"/>
-          <w:sz w:val="14"/>
-        </w:rPr>
-        <w:lastRenderedPageBreak/>
-        <w:t>━━━━━━━━━━━━━━━━━━━━━━━━━━━━━━━━━━━━━━━━━━━━━━━━━━</w:t>
-      </w:r>
-    </w:p>
-    <w:p>
-      <w:pPr>
-        <w:jc w:val="center"/>
-      </w:pPr>
-      <w:r>
-        <w:rPr>
-          <w:color w:val="787878"/>
-          <w:sz w:val="14"/>
-        </w:rPr>
-        <w:t xml:space="preserve">GENKAI </w:t>
-      </w:r>
-      <w:proofErr w:type="spellStart"/>
-      <w:r>
-        <w:rPr>
-          <w:color w:val="787878"/>
-          <w:sz w:val="14"/>
-        </w:rPr>
-        <w:t>限界</w:t>
-      </w:r>
-      <w:proofErr w:type="spellEnd"/>
-      <w:r>
-        <w:rPr>
-          <w:color w:val="787878"/>
-          <w:sz w:val="14"/>
-        </w:rPr>
-        <w:t xml:space="preserve"> v1.2</w:t>
       </w:r>
     </w:p>
     <w:sectPr>

</xml_diff>